<commit_message>
README and A1.5 errors fixed
</commit_message>
<xml_diff>
--- a/docs/Короткие_инструкции/docx/A1_5_Настройка_OLED_дисплея.docx
+++ b/docs/Короткие_инструкции/docx/A1_5_Настройка_OLED_дисплея.docx
@@ -48,7 +48,21 @@
           <w:rFonts w:hint="default"/>
           <w:lang w:val="ru-RU"/>
         </w:rPr>
-        <w:t>Настройка OLED-дисплея (шаг [A0.5])</w:t>
+        <w:t>Настройка OLED-дисплея (шаг [A</w:t>
+      </w:r>
+      <w:r>
+        <w:rPr>
+          <w:rFonts w:hint="default"/>
+          <w:lang w:val="en-US"/>
+        </w:rPr>
+        <w:t>1</w:t>
+      </w:r>
+      <w:r>
+        <w:rPr>
+          <w:rFonts w:hint="default"/>
+          <w:lang w:val="ru-RU"/>
+        </w:rPr>
+        <w:t>.5])</w:t>
       </w:r>
     </w:p>
     <w:p>
@@ -257,6 +271,7 @@
     <w:p>
       <w:pPr>
         <w:numPr>
+          <w:ilvl w:val="0"/>
           <w:numId w:val="0"/>
         </w:numPr>
         <w:ind w:leftChars="0"/>
@@ -330,6 +345,7 @@
     <w:p>
       <w:pPr>
         <w:numPr>
+          <w:ilvl w:val="0"/>
           <w:numId w:val="0"/>
         </w:numPr>
         <w:ind w:leftChars="0" w:firstLine="720" w:firstLineChars="0"/>
@@ -430,6 +446,7 @@
     <w:p>
       <w:pPr>
         <w:numPr>
+          <w:ilvl w:val="0"/>
           <w:numId w:val="0"/>
         </w:numPr>
         <w:bidi w:val="0"/>
@@ -768,8 +785,6 @@
         </w:rPr>
         <w:t xml:space="preserve"> коннектор выткнуть-воткнуть, для перезагрузки.</w:t>
       </w:r>
-      <w:bookmarkStart w:id="1" w:name="_GoBack"/>
-      <w:bookmarkEnd w:id="1"/>
     </w:p>
     <w:p>
       <w:pPr>
@@ -825,7 +840,25 @@
           <w:bCs/>
           <w:lang w:val="ru-RU"/>
         </w:rPr>
-        <w:t>[A1]</w:t>
+        <w:t>[A</w:t>
+      </w:r>
+      <w:r>
+        <w:rPr>
+          <w:rFonts w:hint="default"/>
+          <w:b/>
+          <w:bCs/>
+          <w:lang w:val="en-US"/>
+        </w:rPr>
+        <w:t>2</w:t>
+      </w:r>
+      <w:r>
+        <w:rPr>
+          <w:rFonts w:hint="default"/>
+          <w:b/>
+          <w:bCs/>
+          <w:lang w:val="ru-RU"/>
+        </w:rPr>
+        <w:t>]</w:t>
       </w:r>
       <w:r>
         <w:rPr>
@@ -834,7 +867,7 @@
           <w:bCs w:val="0"/>
           <w:lang w:val="ru-RU"/>
         </w:rPr>
-        <w:t xml:space="preserve"> - Развёртывание репозитория с ПО (</w:t>
+        <w:t xml:space="preserve"> - Настройка </w:t>
       </w:r>
       <w:r>
         <w:rPr>
@@ -843,32 +876,17 @@
           <w:bCs w:val="0"/>
           <w:lang w:val="en-US"/>
         </w:rPr>
-        <w:t>A1</w:t>
-      </w:r>
-      <w:r>
-        <w:rPr>
-          <w:rFonts w:hint="default"/>
-          <w:b w:val="0"/>
-          <w:bCs w:val="0"/>
-          <w:lang w:val="ru-RU"/>
-        </w:rPr>
-        <w:t>_</w:t>
-      </w:r>
-      <w:r>
-        <w:rPr>
-          <w:rFonts w:hint="default"/>
-          <w:lang w:val="ru-RU"/>
-        </w:rPr>
-        <w:t>Развёртывание_репозитория_с_ПО_для_jetbot_mirea.docx).</w:t>
-      </w:r>
-    </w:p>
-    <w:p>
-      <w:pPr>
-        <w:rPr>
-          <w:rFonts w:hint="default"/>
-          <w:lang w:val="ru-RU"/>
-        </w:rPr>
-      </w:pPr>
+        <w:t>ESP32</w:t>
+      </w:r>
+      <w:r>
+        <w:rPr>
+          <w:rFonts w:hint="default"/>
+          <w:lang w:val="ru-RU"/>
+        </w:rPr>
+        <w:t>.</w:t>
+      </w:r>
+      <w:bookmarkStart w:id="1" w:name="_GoBack"/>
+      <w:bookmarkEnd w:id="1"/>
     </w:p>
     <w:p>
       <w:pPr>
@@ -1047,6 +1065,12 @@
             <w:insideH w:val="single" w:color="auto" w:sz="4" w:space="0"/>
             <w:insideV w:val="single" w:color="auto" w:sz="4" w:space="0"/>
           </w:tblBorders>
+          <w:tblCellMar>
+            <w:top w:w="0" w:type="dxa"/>
+            <w:left w:w="108" w:type="dxa"/>
+            <w:bottom w:w="0" w:type="dxa"/>
+            <w:right w:w="108" w:type="dxa"/>
+          </w:tblCellMar>
         </w:tblPrEx>
         <w:tc>
           <w:tcPr>
@@ -1131,6 +1155,12 @@
             <w:insideH w:val="single" w:color="auto" w:sz="4" w:space="0"/>
             <w:insideV w:val="single" w:color="auto" w:sz="4" w:space="0"/>
           </w:tblBorders>
+          <w:tblCellMar>
+            <w:top w:w="0" w:type="dxa"/>
+            <w:left w:w="108" w:type="dxa"/>
+            <w:bottom w:w="0" w:type="dxa"/>
+            <w:right w:w="108" w:type="dxa"/>
+          </w:tblCellMar>
         </w:tblPrEx>
         <w:tc>
           <w:tcPr>

</xml_diff>